<commit_message>
Ingest source reviewer metadata and research candidates
</commit_message>
<xml_diff>
--- a/backend/src/modules/nutrition/FITEATSY_BATCH_1_SOURCE_IDENTITY_REVIEW_TASK_v1_UPDATED.docx
+++ b/backend/src/modules/nutrition/FITEATSY_BATCH_1_SOURCE_IDENTITY_REVIEW_TASK_v1_UPDATED.docx
@@ -688,7 +688,7 @@
                 <w:color w:val="000000"/>
                 <w:sz w:val="21"/>
               </w:rPr>
-              <w:t>____________________________</w:t>
+              <w:t>Priyanshi Srivastava</w:t>
             </w:r>
           </w:p>
         </w:tc>
@@ -731,7 +731,7 @@
                 <w:color w:val="000000"/>
                 <w:sz w:val="21"/>
               </w:rPr>
-              <w:t>____________________________</w:t>
+              <w:t>3 Sept 2026</w:t>
             </w:r>
           </w:p>
         </w:tc>
@@ -1145,7 +1145,7 @@
                 <w:color w:val="000000"/>
                 <w:sz w:val="21"/>
               </w:rPr>
-              <w:t>____________________________</w:t>
+              <w:t>Priyanshi Srivastava</w:t>
             </w:r>
           </w:p>
         </w:tc>
@@ -1188,7 +1188,7 @@
                 <w:color w:val="000000"/>
                 <w:sz w:val="21"/>
               </w:rPr>
-              <w:t>____________________________</w:t>
+              <w:t>3 Sept 2026</w:t>
             </w:r>
           </w:p>
         </w:tc>
@@ -1602,7 +1602,7 @@
                 <w:color w:val="000000"/>
                 <w:sz w:val="21"/>
               </w:rPr>
-              <w:t>____________________________</w:t>
+              <w:t>Priyanshi Srivastava</w:t>
             </w:r>
           </w:p>
         </w:tc>
@@ -1645,7 +1645,7 @@
                 <w:color w:val="000000"/>
                 <w:sz w:val="21"/>
               </w:rPr>
-              <w:t>____________________________</w:t>
+              <w:t>3 Sept 2026</w:t>
             </w:r>
           </w:p>
         </w:tc>
@@ -2059,7 +2059,7 @@
                 <w:color w:val="000000"/>
                 <w:sz w:val="21"/>
               </w:rPr>
-              <w:t>____________________________</w:t>
+              <w:t>Priyanshi Srivastava</w:t>
             </w:r>
           </w:p>
         </w:tc>
@@ -2102,7 +2102,7 @@
                 <w:color w:val="000000"/>
                 <w:sz w:val="21"/>
               </w:rPr>
-              <w:t>____________________________</w:t>
+              <w:t>3 Sept 2026</w:t>
             </w:r>
           </w:p>
         </w:tc>
@@ -2516,7 +2516,7 @@
                 <w:color w:val="000000"/>
                 <w:sz w:val="21"/>
               </w:rPr>
-              <w:t>____________________________</w:t>
+              <w:t>Priyanshi Srivastava</w:t>
             </w:r>
           </w:p>
         </w:tc>
@@ -2559,7 +2559,7 @@
                 <w:color w:val="000000"/>
                 <w:sz w:val="21"/>
               </w:rPr>
-              <w:t>____________________________</w:t>
+              <w:t>3 Sept 2026</w:t>
             </w:r>
           </w:p>
         </w:tc>

</xml_diff>

<commit_message>
Close measurement audit metadata gate
</commit_message>
<xml_diff>
--- a/backend/src/modules/nutrition/FITEATSY_BATCH_1_SOURCE_IDENTITY_REVIEW_TASK_v1_UPDATED.docx
+++ b/backend/src/modules/nutrition/FITEATSY_BATCH_1_SOURCE_IDENTITY_REVIEW_TASK_v1_UPDATED.docx
@@ -844,7 +844,7 @@
                 <w:color w:val="000000"/>
                 <w:sz w:val="21"/>
               </w:rPr>
-              <w:t>USDA FDC 173412</w:t>
+              <w:t>USDA FDC 171314 (SR Legacy 2018-04)</w:t>
             </w:r>
           </w:p>
         </w:tc>
@@ -887,7 +887,7 @@
                 <w:color w:val="000000"/>
                 <w:sz w:val="21"/>
               </w:rPr>
-              <w:t>Butter oil, anhydrous</w:t>
+              <w:t>Butter, Clarified butter (ghee)</w:t>
             </w:r>
           </w:p>
         </w:tc>
@@ -930,7 +930,7 @@
                 <w:color w:val="000000"/>
                 <w:sz w:val="21"/>
               </w:rPr>
-              <w:t>Cow species and exact ghee-preparation equivalence are not established by the source description. Approval must confirm that this source is sufficiently equivalent to the required COW_GHEE identity; otherwise request an alternate approved source.</w:t>
+              <w:t>This is a stronger preparation-name candidate than prior FDC 173412 (Butter oil, anhydrous), which remains in candidate history. The mandatory core vector is complete, but Cow-species identity is not established by the description. Human identity review remains required.</w:t>
             </w:r>
           </w:p>
         </w:tc>
@@ -2598,6 +2598,20 @@
           <w:color w:val="666666"/>
           <w:sz w:val="18"/>
         </w:rPr>
+        <w:t>https://fdc.nal.usda.gov/download-datasets/</w:t>
+      </w:r>
+    </w:p>
+    <w:p>
+      <w:pPr>
+        <w:spacing w:after="60"/>
+      </w:pPr>
+      <w:r>
+        <w:rPr>
+          <w:rFonts w:ascii="Calibri" w:hAnsi="Calibri"/>
+          <w:b w:val="0"/>
+          <w:color w:val="666666"/>
+          <w:sz w:val="18"/>
+        </w:rPr>
         <w:t>https://fdc.nal.usda.gov/fdc-app.html#/food-details/1750349/nutrients</w:t>
       </w:r>
     </w:p>
@@ -2612,7 +2626,7 @@
           <w:color w:val="666666"/>
           <w:sz w:val="18"/>
         </w:rPr>
-        <w:t>https://fdc.nal.usda.gov/fdc-app.html#/food-details/173412/nutrients</w:t>
+        <w:t>https://fdc.nal.usda.gov/fdc-app.html#/food-details/171314/nutrients</w:t>
       </w:r>
     </w:p>
     <w:p>

</xml_diff>